<commit_message>
Publish phone-free CV suite (phone number removed from public documents)
</commit_message>
<xml_diff>
--- a/assets/cv/Juwen_Lie_CV_2026.docx
+++ b/assets/cv/Juwen_Lie_CV_2026.docx
@@ -24,7 +24,7 @@
         <w:rPr>
           <w:sz w:val="19"/>
         </w:rPr>
-        <w:t>Batam, Indonesia  |  +62 813-6419-3579  |  juwen12006@gmail.com</w:t>
+        <w:t>Batam, Indonesia  |  juwen12006@gmail.com</w:t>
       </w:r>
     </w:p>
     <w:p>
@@ -289,7 +289,7 @@
         <w:spacing w:after="40"/>
       </w:pPr>
       <w:r>
-        <w:t>Research: preconditioning method for 1D Euler equations on a diverging nozzle (benchmarked against Roe, Van Leer, Steger-Warming); research proposal on numerical simulation of two-phase flow in geothermal wells.</w:t>
+        <w:t>Research: preconditioning method for 1D Euler equations on a diverging nozzle (vs Roe, Van Leer, Steger-Warming); research proposal on numerical simulation of two-phase flow in geothermal wells.</w:t>
       </w:r>
     </w:p>
     <w:p>

</xml_diff>